<commit_message>
13062026-Add Plan 1 data-foundation implementation plan and D-011
Co-Authored-By: Claude Opus 4.8 (1M context) <noreply@anthropic.com>
</commit_message>
<xml_diff>
--- a/docs/exports/06-DECISIONS.docx
+++ b/docs/exports/06-DECISIONS.docx
@@ -10,7 +10,7 @@
         <w:t xml:space="preserve">06-DECISIONS</w:t>
       </w:r>
     </w:p>
-    <w:bookmarkStart w:id="19" w:name="decision-log-problems-solutions"/>
+    <w:bookmarkStart w:id="20" w:name="decision-log-problems-solutions"/>
     <w:p>
       <w:pPr>
         <w:pStyle w:val="Heading1"/>
@@ -1147,6 +1147,216 @@
         <w:t xml:space="preserve">alone is enough to understand and rebuild the system.</w:t>
       </w:r>
     </w:p>
+    <w:bookmarkEnd w:id="18"/>
+    <w:bookmarkStart w:id="19" w:name="X650a3de755ba4a4fa6ab89089e39708042035be"/>
+    <w:p>
+      <w:pPr>
+        <w:pStyle w:val="Heading3"/>
+      </w:pPr>
+      <w:r>
+        <w:t xml:space="preserve">D-011 — Schema source-of-truth is SQL migrations; Drizzle adopts via introspection</w:t>
+      </w:r>
+    </w:p>
+    <w:p>
+      <w:pPr>
+        <w:pStyle w:val="Compact"/>
+        <w:numPr>
+          <w:ilvl w:val="0"/>
+          <w:numId w:val="1011"/>
+        </w:numPr>
+      </w:pPr>
+      <w:r>
+        <w:rPr>
+          <w:b/>
+          <w:bCs/>
+        </w:rPr>
+        <w:t xml:space="preserve">Problem:</w:t>
+      </w:r>
+      <w:r>
+        <w:t xml:space="preserve"> </w:t>
+      </w:r>
+      <w:r>
+        <w:t xml:space="preserve">Both the Python engine (ingestion/clustering/crew) and the Next.js website</w:t>
+      </w:r>
+      <w:r>
+        <w:t xml:space="preserve"> </w:t>
+      </w:r>
+      <w:r>
+        <w:t xml:space="preserve">read/write the same Postgres. If Drizzle owns the schema, the Python pipeline can’t be</w:t>
+      </w:r>
+      <w:r>
+        <w:t xml:space="preserve"> </w:t>
+      </w:r>
+      <w:r>
+        <w:t xml:space="preserve">built or tested before the website exists — but the build order starts with the data layer.</w:t>
+      </w:r>
+    </w:p>
+    <w:p>
+      <w:pPr>
+        <w:pStyle w:val="Compact"/>
+        <w:numPr>
+          <w:ilvl w:val="0"/>
+          <w:numId w:val="1011"/>
+        </w:numPr>
+      </w:pPr>
+      <w:r>
+        <w:rPr>
+          <w:b/>
+          <w:bCs/>
+        </w:rPr>
+        <w:t xml:space="preserve">Decision:</w:t>
+      </w:r>
+      <w:r>
+        <w:t xml:space="preserve"> </w:t>
+      </w:r>
+      <w:r>
+        <w:t xml:space="preserve">Author the schema as plain</w:t>
+      </w:r>
+      <w:r>
+        <w:t xml:space="preserve"> </w:t>
+      </w:r>
+      <w:r>
+        <w:rPr>
+          <w:b/>
+          <w:bCs/>
+        </w:rPr>
+        <w:t xml:space="preserve">SQL migrations</w:t>
+      </w:r>
+      <w:r>
+        <w:t xml:space="preserve"> </w:t>
+      </w:r>
+      <w:r>
+        <w:t xml:space="preserve">in</w:t>
+      </w:r>
+      <w:r>
+        <w:t xml:space="preserve"> </w:t>
+      </w:r>
+      <w:r>
+        <w:rPr>
+          <w:rStyle w:val="VerbatimChar"/>
+        </w:rPr>
+        <w:t xml:space="preserve">db/migrations/</w:t>
+      </w:r>
+      <w:r>
+        <w:t xml:space="preserve">, applied</w:t>
+      </w:r>
+      <w:r>
+        <w:t xml:space="preserve"> </w:t>
+      </w:r>
+      <w:r>
+        <w:t xml:space="preserve">by a small Python runner. The website (Plan 3) generates its typed Drizzle schema from</w:t>
+      </w:r>
+      <w:r>
+        <w:t xml:space="preserve"> </w:t>
+      </w:r>
+      <w:r>
+        <w:t xml:space="preserve">the live DB with</w:t>
+      </w:r>
+      <w:r>
+        <w:t xml:space="preserve"> </w:t>
+      </w:r>
+      <w:r>
+        <w:rPr>
+          <w:rStyle w:val="VerbatimChar"/>
+        </w:rPr>
+        <w:t xml:space="preserve">drizzle-kit pull</w:t>
+      </w:r>
+      <w:r>
+        <w:t xml:space="preserve">. Postgres runs from the</w:t>
+      </w:r>
+      <w:r>
+        <w:t xml:space="preserve"> </w:t>
+      </w:r>
+      <w:r>
+        <w:rPr>
+          <w:rStyle w:val="VerbatimChar"/>
+        </w:rPr>
+        <w:t xml:space="preserve">pgvector/pgvector</w:t>
+      </w:r>
+      <w:r>
+        <w:t xml:space="preserve"> </w:t>
+      </w:r>
+      <w:r>
+        <w:t xml:space="preserve">image so</w:t>
+      </w:r>
+      <w:r>
+        <w:t xml:space="preserve"> </w:t>
+      </w:r>
+      <w:r>
+        <w:t xml:space="preserve">the</w:t>
+      </w:r>
+      <w:r>
+        <w:t xml:space="preserve"> </w:t>
+      </w:r>
+      <w:r>
+        <w:rPr>
+          <w:rStyle w:val="VerbatimChar"/>
+        </w:rPr>
+        <w:t xml:space="preserve">vector</w:t>
+      </w:r>
+      <w:r>
+        <w:t xml:space="preserve"> </w:t>
+      </w:r>
+      <w:r>
+        <w:t xml:space="preserve">type is available.</w:t>
+      </w:r>
+    </w:p>
+    <w:p>
+      <w:pPr>
+        <w:pStyle w:val="Compact"/>
+        <w:numPr>
+          <w:ilvl w:val="0"/>
+          <w:numId w:val="1011"/>
+        </w:numPr>
+      </w:pPr>
+      <w:r>
+        <w:rPr>
+          <w:b/>
+          <w:bCs/>
+        </w:rPr>
+        <w:t xml:space="preserve">Rejected:</w:t>
+      </w:r>
+      <w:r>
+        <w:t xml:space="preserve"> </w:t>
+      </w:r>
+      <w:r>
+        <w:t xml:space="preserve">Drizzle-first (forces the frontend to exist before the data pipeline);</w:t>
+      </w:r>
+      <w:r>
+        <w:t xml:space="preserve"> </w:t>
+      </w:r>
+      <w:r>
+        <w:t xml:space="preserve">duplicating the schema in two ORMs (drift risk).</w:t>
+      </w:r>
+    </w:p>
+    <w:p>
+      <w:pPr>
+        <w:pStyle w:val="Compact"/>
+        <w:numPr>
+          <w:ilvl w:val="0"/>
+          <w:numId w:val="1011"/>
+        </w:numPr>
+      </w:pPr>
+      <w:r>
+        <w:rPr>
+          <w:b/>
+          <w:bCs/>
+        </w:rPr>
+        <w:t xml:space="preserve">Consequence:</w:t>
+      </w:r>
+      <w:r>
+        <w:t xml:space="preserve"> </w:t>
+      </w:r>
+      <w:r>
+        <w:t xml:space="preserve">The data foundation is independent and testable on its own; one SQL</w:t>
+      </w:r>
+      <w:r>
+        <w:t xml:space="preserve"> </w:t>
+      </w:r>
+      <w:r>
+        <w:t xml:space="preserve">source of truth; Drizzle stays a typed query layer, not the schema owner.</w:t>
+      </w:r>
+    </w:p>
     <w:p>
       <w:r>
         <w:pict>
@@ -1213,8 +1423,8 @@
         <w:t xml:space="preserve">- **Consequence:** …</w:t>
       </w:r>
     </w:p>
-    <w:bookmarkEnd w:id="18"/>
     <w:bookmarkEnd w:id="19"/>
+    <w:bookmarkEnd w:id="20"/>
     <w:sectPr>
       <w:footnotePr>
         <w:numRestart w:val="eachSect"/>
@@ -1459,6 +1669,9 @@
     <w:abstractNumId w:val="991"/>
   </w:num>
   <w:num w:numId="1010">
+    <w:abstractNumId w:val="991"/>
+  </w:num>
+  <w:num w:numId="1011">
     <w:abstractNumId w:val="991"/>
   </w:num>
 </w:numbering>

</xml_diff>